<commit_message>
Docs: Friend list / Our Space design spec and concepts, Harmony plan, updated roadmap
Co-Authored-By: Claude Opus 5.5 <noreply@anthropic.com>
Claude-Session: https://claude.ai/code/session_01DXA9qmFhVFySC6QBMCPRvb
</commit_message>
<xml_diff>
--- a/Aluta Project Audit Report/Aluta_Technical_Analysis_Roadmap.docx
+++ b/Aluta Project Audit Report/Aluta_Technical_Analysis_Roadmap.docx
@@ -2184,82 +2184,118 @@
     <w:p>
       <w:pPr>
         <w:pStyle w:val="SourceCode"/>
-      </w:pPr>
-      <w:r>
-        <w:rPr>
-          <w:rStyle w:val="VerbatimChar"/>
+        <w:rPr>
+          <w:color w:val="00B050"/>
+        </w:rPr>
+      </w:pPr>
+      <w:r>
+        <w:rPr>
+          <w:rStyle w:val="VerbatimChar"/>
+          <w:color w:val="00B050"/>
         </w:rPr>
         <w:t>Add Firebase Cloud Messaging to Aluta so messages and calls arrive when the app</w:t>
       </w:r>
       <w:r>
-        <w:br/>
-      </w:r>
-      <w:r>
-        <w:rPr>
-          <w:rStyle w:val="VerbatimChar"/>
+        <w:rPr>
+          <w:color w:val="00B050"/>
+        </w:rPr>
+        <w:br/>
+      </w:r>
+      <w:r>
+        <w:rPr>
+          <w:rStyle w:val="VerbatimChar"/>
+          <w:color w:val="00B050"/>
         </w:rPr>
         <w:t>is backgrounded or closed (right now notif_service is local-only, so nothing</w:t>
       </w:r>
       <w:r>
-        <w:br/>
-      </w:r>
-      <w:r>
-        <w:rPr>
-          <w:rStyle w:val="VerbatimChar"/>
+        <w:rPr>
+          <w:color w:val="00B050"/>
+        </w:rPr>
+        <w:br/>
+      </w:r>
+      <w:r>
+        <w:rPr>
+          <w:rStyle w:val="VerbatimChar"/>
+          <w:color w:val="00B050"/>
         </w:rPr>
         <w:t>wakes the phone). Client: add firebase_core + firebase_messaging, register the</w:t>
       </w:r>
       <w:r>
-        <w:br/>
-      </w:r>
-      <w:r>
-        <w:rPr>
-          <w:rStyle w:val="VerbatimChar"/>
+        <w:rPr>
+          <w:color w:val="00B050"/>
+        </w:rPr>
+        <w:br/>
+      </w:r>
+      <w:r>
+        <w:rPr>
+          <w:rStyle w:val="VerbatimChar"/>
+          <w:color w:val="00B050"/>
         </w:rPr>
         <w:t>FCM token on login and store it server-side (new device_tokens table), and</w:t>
       </w:r>
       <w:r>
-        <w:br/>
-      </w:r>
-      <w:r>
-        <w:rPr>
-          <w:rStyle w:val="VerbatimChar"/>
+        <w:rPr>
+          <w:color w:val="00B050"/>
+        </w:rPr>
+        <w:br/>
+      </w:r>
+      <w:r>
+        <w:rPr>
+          <w:rStyle w:val="VerbatimChar"/>
+          <w:color w:val="00B050"/>
         </w:rPr>
         <w:t>handle foreground/background/terminated messages including showing an incoming-</w:t>
       </w:r>
       <w:r>
-        <w:br/>
-      </w:r>
-      <w:r>
-        <w:rPr>
-          <w:rStyle w:val="VerbatimChar"/>
+        <w:rPr>
+          <w:color w:val="00B050"/>
+        </w:rPr>
+        <w:br/>
+      </w:r>
+      <w:r>
+        <w:rPr>
+          <w:rStyle w:val="VerbatimChar"/>
+          <w:color w:val="00B050"/>
         </w:rPr>
         <w:t>call notification. Backend (FastAPI): add an endpoint to save device tokens plus</w:t>
       </w:r>
       <w:r>
-        <w:br/>
-      </w:r>
-      <w:r>
-        <w:rPr>
-          <w:rStyle w:val="VerbatimChar"/>
+        <w:rPr>
+          <w:color w:val="00B050"/>
+        </w:rPr>
+        <w:br/>
+      </w:r>
+      <w:r>
+        <w:rPr>
+          <w:rStyle w:val="VerbatimChar"/>
+          <w:color w:val="00B050"/>
         </w:rPr>
         <w:t>a push helper, and fire a data push on new_message and on call_offer. Add the</w:t>
       </w:r>
       <w:r>
-        <w:br/>
-      </w:r>
-      <w:r>
-        <w:rPr>
-          <w:rStyle w:val="VerbatimChar"/>
+        <w:rPr>
+          <w:color w:val="00B050"/>
+        </w:rPr>
+        <w:br/>
+      </w:r>
+      <w:r>
+        <w:rPr>
+          <w:rStyle w:val="VerbatimChar"/>
+          <w:color w:val="00B050"/>
         </w:rPr>
         <w:t>Android Gradle/manifest config. Then walk me step-by-step through the Firebase</w:t>
       </w:r>
       <w:r>
-        <w:br/>
-      </w:r>
-      <w:r>
-        <w:rPr>
-          <w:rStyle w:val="VerbatimChar"/>
+        <w:rPr>
+          <w:color w:val="00B050"/>
+        </w:rPr>
+        <w:br/>
+      </w:r>
+      <w:r>
+        <w:rPr>
+          <w:rStyle w:val="VerbatimChar"/>
+          <w:color w:val="00B050"/>
         </w:rPr>
         <w:t>console setup I must do myself — I have no existing Firebase project.</w:t>
       </w:r>
@@ -2267,15 +2303,11 @@
     <w:p>
       <w:pPr>
         <w:pStyle w:val="FirstParagraph"/>
-        <w:rPr>
-          <w:color w:val="00B050"/>
-        </w:rPr>
-      </w:pPr>
-      <w:r>
-        <w:rPr>
-          <w:b/>
-          <w:bCs/>
-          <w:color w:val="00B050"/>
+      </w:pPr>
+      <w:r>
+        <w:rPr>
+          <w:b/>
+          <w:bCs/>
         </w:rPr>
         <w:t>A3 — Make the WebSocket the real delivery path (retire the 2s poll)</w:t>
       </w:r>
@@ -2292,7 +2324,15 @@
           <w:rStyle w:val="VerbatimChar"/>
           <w:color w:val="00B050"/>
         </w:rPr>
-        <w:t>In Aluta's chat_</w:t>
+        <w:t xml:space="preserve">In Aluta's </w:t>
+      </w:r>
+      <w:proofErr w:type="spellStart"/>
+      <w:r>
+        <w:rPr>
+          <w:rStyle w:val="VerbatimChar"/>
+          <w:color w:val="00B050"/>
+        </w:rPr>
+        <w:t>chat_</w:t>
       </w:r>
       <w:proofErr w:type="gramStart"/>
       <w:r>
@@ -2302,6 +2342,7 @@
         </w:rPr>
         <w:t>page.dart</w:t>
       </w:r>
+      <w:proofErr w:type="spellEnd"/>
       <w:proofErr w:type="gramEnd"/>
       <w:r>
         <w:rPr>
@@ -3141,55 +3182,95 @@
     <w:p>
       <w:pPr>
         <w:pStyle w:val="SourceCode"/>
-      </w:pPr>
-      <w:r>
-        <w:rPr>
-          <w:rStyle w:val="VerbatimChar"/>
+        <w:rPr>
+          <w:color w:val="00B050"/>
+        </w:rPr>
+      </w:pPr>
+      <w:r>
+        <w:rPr>
+          <w:rStyle w:val="VerbatimChar"/>
+          <w:color w:val="00B050"/>
         </w:rPr>
         <w:t>Extend Aluta from 1:1 to group conversations. Backend: add conversations +</w:t>
       </w:r>
       <w:r>
-        <w:br/>
-      </w:r>
-      <w:r>
-        <w:rPr>
-          <w:rStyle w:val="VerbatimChar"/>
+        <w:rPr>
+          <w:color w:val="00B050"/>
+        </w:rPr>
+        <w:br/>
+      </w:r>
+      <w:r>
+        <w:rPr>
+          <w:rStyle w:val="VerbatimChar"/>
+          <w:color w:val="00B050"/>
         </w:rPr>
         <w:t>members models (a conversation has many users; messages belong to a</w:t>
       </w:r>
       <w:r>
-        <w:br/>
-      </w:r>
-      <w:r>
-        <w:rPr>
-          <w:rStyle w:val="VerbatimChar"/>
-        </w:rPr>
-        <w:t>conversation), migrate the existing 1:1 messages into 2-member conversations, and</w:t>
-      </w:r>
-      <w:r>
-        <w:br/>
-      </w:r>
-      <w:r>
-        <w:rPr>
-          <w:rStyle w:val="VerbatimChar"/>
+        <w:rPr>
+          <w:color w:val="00B050"/>
+        </w:rPr>
+        <w:br/>
+      </w:r>
+      <w:r>
+        <w:rPr>
+          <w:rStyle w:val="VerbatimChar"/>
+          <w:color w:val="00B050"/>
+        </w:rPr>
+        <w:t xml:space="preserve">conversation), migrate the existing 1:1 </w:t>
+      </w:r>
+      <w:proofErr w:type="gramStart"/>
+      <w:r>
+        <w:rPr>
+          <w:rStyle w:val="VerbatimChar"/>
+          <w:color w:val="00B050"/>
+        </w:rPr>
+        <w:t>messages</w:t>
+      </w:r>
+      <w:proofErr w:type="gramEnd"/>
+      <w:r>
+        <w:rPr>
+          <w:rStyle w:val="VerbatimChar"/>
+          <w:color w:val="00B050"/>
+        </w:rPr>
+        <w:t xml:space="preserve"> into 2-member conversations, and</w:t>
+      </w:r>
+      <w:r>
+        <w:rPr>
+          <w:color w:val="00B050"/>
+        </w:rPr>
+        <w:br/>
+      </w:r>
+      <w:r>
+        <w:rPr>
+          <w:rStyle w:val="VerbatimChar"/>
+          <w:color w:val="00B050"/>
         </w:rPr>
         <w:t>update the send/fetch/read endpoints and WS fan-out to target a conversation's</w:t>
       </w:r>
       <w:r>
-        <w:br/>
-      </w:r>
-      <w:r>
-        <w:rPr>
-          <w:rStyle w:val="VerbatimChar"/>
+        <w:rPr>
+          <w:color w:val="00B050"/>
+        </w:rPr>
+        <w:br/>
+      </w:r>
+      <w:r>
+        <w:rPr>
+          <w:rStyle w:val="VerbatimChar"/>
+          <w:color w:val="00B050"/>
         </w:rPr>
         <w:t>members. Client: group creation, a group chat screen (reuse chat_page), member</w:t>
       </w:r>
       <w:r>
-        <w:br/>
-      </w:r>
-      <w:r>
-        <w:rPr>
-          <w:rStyle w:val="VerbatimChar"/>
+        <w:rPr>
+          <w:color w:val="00B050"/>
+        </w:rPr>
+        <w:br/>
+      </w:r>
+      <w:r>
+        <w:rPr>
+          <w:rStyle w:val="VerbatimChar"/>
+          <w:color w:val="00B050"/>
         </w:rPr>
         <w:t>avatars, and sender labels on messages. Keep DMs working unchanged.</w:t>
       </w:r>
@@ -3209,46 +3290,66 @@
     <w:p>
       <w:pPr>
         <w:pStyle w:val="SourceCode"/>
-      </w:pPr>
-      <w:r>
-        <w:rPr>
-          <w:rStyle w:val="VerbatimChar"/>
+        <w:rPr>
+          <w:color w:val="00B050"/>
+        </w:rPr>
+      </w:pPr>
+      <w:r>
+        <w:rPr>
+          <w:rStyle w:val="VerbatimChar"/>
+          <w:color w:val="00B050"/>
         </w:rPr>
         <w:t>Add ephemeral Stories to Aluta: a user posts a photo/short clip or a "now</w:t>
       </w:r>
       <w:r>
-        <w:br/>
-      </w:r>
-      <w:r>
-        <w:rPr>
-          <w:rStyle w:val="VerbatimChar"/>
+        <w:rPr>
+          <w:color w:val="00B050"/>
+        </w:rPr>
+        <w:br/>
+      </w:r>
+      <w:r>
+        <w:rPr>
+          <w:rStyle w:val="VerbatimChar"/>
+          <w:color w:val="00B050"/>
         </w:rPr>
         <w:t>playing" moment that expires in 24h. Backend: a stories table with expiry and a</w:t>
       </w:r>
       <w:r>
-        <w:br/>
-      </w:r>
-      <w:r>
-        <w:rPr>
-          <w:rStyle w:val="VerbatimChar"/>
+        <w:rPr>
+          <w:color w:val="00B050"/>
+        </w:rPr>
+        <w:br/>
+      </w:r>
+      <w:r>
+        <w:rPr>
+          <w:rStyle w:val="VerbatimChar"/>
+          <w:color w:val="00B050"/>
         </w:rPr>
         <w:t>viewed-by list, auto-expiring server-side. Client: a stories tray atop the</w:t>
       </w:r>
       <w:r>
-        <w:br/>
-      </w:r>
-      <w:r>
-        <w:rPr>
-          <w:rStyle w:val="VerbatimChar"/>
+        <w:rPr>
+          <w:color w:val="00B050"/>
+        </w:rPr>
+        <w:br/>
+      </w:r>
+      <w:r>
+        <w:rPr>
+          <w:rStyle w:val="VerbatimChar"/>
+          <w:color w:val="00B050"/>
         </w:rPr>
         <w:t>Messages list, a full-screen viewer with tap-through and progress bars, and a</w:t>
       </w:r>
       <w:r>
-        <w:br/>
-      </w:r>
-      <w:r>
-        <w:rPr>
-          <w:rStyle w:val="VerbatimChar"/>
+        <w:rPr>
+          <w:color w:val="00B050"/>
+        </w:rPr>
+        <w:br/>
+      </w:r>
+      <w:r>
+        <w:rPr>
+          <w:rStyle w:val="VerbatimChar"/>
+          <w:color w:val="00B050"/>
         </w:rPr>
         <w:t>"who viewed" list.</w:t>
       </w:r>
@@ -3263,6 +3364,30 @@
           <w:bCs/>
         </w:rPr>
         <w:t>B3 — Global message &amp; media search</w:t>
+      </w:r>
+      <w:r>
+        <w:rPr>
+          <w:b/>
+          <w:bCs/>
+        </w:rPr>
+        <w:t xml:space="preserve"> (</w:t>
+      </w:r>
+      <w:r>
+        <w:rPr>
+          <w:i/>
+          <w:iCs/>
+          <w:color w:val="00B050"/>
+          <w:sz w:val="20"/>
+          <w:szCs w:val="20"/>
+        </w:rPr>
+        <w:t>Implemented notification auto navigation to thread group/DM auto scrolling to exact message the rest of this feature will be considered in future</w:t>
+      </w:r>
+      <w:r>
+        <w:rPr>
+          <w:b/>
+          <w:bCs/>
+        </w:rPr>
+        <w:t>)</w:t>
       </w:r>
     </w:p>
     <w:p>

</xml_diff>